<commit_message>
[main][mac] đã thi xong 5 điểm đẹp
</commit_message>
<xml_diff>
--- a/tai_lieu_ban_to_chuc/dap_an_sai_tu_lam_link_bs_trieu.pdf.docx
+++ b/tai_lieu_ban_to_chuc/dap_an_sai_tu_lam_link_bs_trieu.pdf.docx
@@ -1475,6 +1475,13 @@
       </w:pPr>
     </w:p>
     <w:p>
+      <w:pPr>
+        <w:rPr>
+          <w:rFonts w:ascii="Arial" w:hAnsi="Arial" w:cs="Arial"/>
+          <w:sz w:val="27"/>
+          <w:szCs w:val="27"/>
+        </w:rPr>
+      </w:pPr>
       <w:r>
         <w:rPr>
           <w:rFonts w:ascii="Arial" w:hAnsi="Arial" w:cs="Arial"/>
@@ -1516,6 +1523,818 @@
           <w:szCs w:val="27"/>
         </w:rPr>
         <w:t>.</w:t>
+      </w:r>
+    </w:p>
+    <w:p>
+      <w:pPr>
+        <w:rPr>
+          <w:rFonts w:ascii="Arial" w:hAnsi="Arial" w:cs="Arial"/>
+          <w:sz w:val="27"/>
+          <w:szCs w:val="27"/>
+        </w:rPr>
+      </w:pPr>
+    </w:p>
+    <w:p>
+      <w:pPr>
+        <w:rPr>
+          <w:rFonts w:ascii="Arial" w:hAnsi="Arial" w:cs="Arial"/>
+          <w:sz w:val="27"/>
+          <w:szCs w:val="27"/>
+        </w:rPr>
+      </w:pPr>
+      <w:r>
+        <w:rPr>
+          <w:rFonts w:ascii="Arial" w:hAnsi="Arial" w:cs="Arial"/>
+          <w:sz w:val="27"/>
+          <w:szCs w:val="27"/>
+        </w:rPr>
+        <w:t xml:space="preserve">Trong </w:t>
+      </w:r>
+      <w:r>
+        <w:rPr>
+          <w:rFonts w:ascii="Arial" w:hAnsi="Arial" w:cs="Arial"/>
+          <w:sz w:val="27"/>
+          <w:szCs w:val="27"/>
+          <w:highlight w:val="yellow"/>
+        </w:rPr>
+        <w:t>trường hợp</w:t>
+      </w:r>
+      <w:r>
+        <w:rPr>
+          <w:rFonts w:ascii="Arial" w:hAnsi="Arial" w:cs="Arial"/>
+          <w:sz w:val="27"/>
+          <w:szCs w:val="27"/>
+        </w:rPr>
+        <w:t xml:space="preserve"> </w:t>
+      </w:r>
+      <w:r>
+        <w:rPr>
+          <w:rFonts w:ascii="Arial" w:hAnsi="Arial" w:cs="Arial"/>
+          <w:sz w:val="27"/>
+          <w:szCs w:val="27"/>
+          <w:highlight w:val="yellow"/>
+        </w:rPr>
+        <w:t>đặc biệt/đặc thù,</w:t>
+      </w:r>
+      <w:r>
+        <w:rPr>
+          <w:rFonts w:ascii="Arial" w:hAnsi="Arial" w:cs="Arial"/>
+          <w:sz w:val="27"/>
+          <w:szCs w:val="27"/>
+        </w:rPr>
+        <w:t xml:space="preserve"> nếu nhà thầu nước ngoài có yêu cầu ràng buộc không đăng ký trên Hệ thống, chủ đầu tư xử lý tình huống bằng cách </w:t>
+      </w:r>
+      <w:r>
+        <w:rPr>
+          <w:rFonts w:ascii="Arial" w:hAnsi="Arial" w:cs="Arial"/>
+          <w:sz w:val="27"/>
+          <w:szCs w:val="27"/>
+          <w:highlight w:val="yellow"/>
+        </w:rPr>
+        <w:t>không cần yêu cầu nhà thầu đăng ký khi đăng tải kết quả.</w:t>
+      </w:r>
+    </w:p>
+    <w:p>
+      <w:pPr>
+        <w:rPr>
+          <w:rFonts w:ascii="Arial" w:hAnsi="Arial" w:cs="Arial"/>
+          <w:sz w:val="27"/>
+          <w:szCs w:val="27"/>
+        </w:rPr>
+      </w:pPr>
+    </w:p>
+    <w:p>
+      <w:pPr>
+        <w:rPr>
+          <w:rFonts w:ascii="Arial" w:hAnsi="Arial" w:cs="Arial"/>
+          <w:sz w:val="27"/>
+          <w:szCs w:val="27"/>
+        </w:rPr>
+      </w:pPr>
+      <w:r>
+        <w:rPr>
+          <w:rFonts w:ascii="Arial" w:hAnsi="Arial" w:cs="Arial"/>
+          <w:sz w:val="27"/>
+          <w:szCs w:val="27"/>
+          <w:highlight w:val="yellow"/>
+        </w:rPr>
+        <w:t>hủy thầu</w:t>
+      </w:r>
+      <w:r>
+        <w:rPr>
+          <w:rFonts w:ascii="Arial" w:hAnsi="Arial" w:cs="Arial"/>
+          <w:sz w:val="27"/>
+          <w:szCs w:val="27"/>
+        </w:rPr>
+        <w:t xml:space="preserve"> (theo khoản 1 Điều 17 Luật Đấu thầu) và xử lý tình huống không có nhà thầu tham dự, </w:t>
+      </w:r>
+      <w:r>
+        <w:rPr>
+          <w:rFonts w:ascii="Arial" w:hAnsi="Arial" w:cs="Arial"/>
+          <w:sz w:val="27"/>
+          <w:szCs w:val="27"/>
+          <w:highlight w:val="yellow"/>
+        </w:rPr>
+        <w:t>chủ đầu tư không phải điều chỉnh thời gian bắt đầu tổ chức lựa chọn nhà thầu trong kế hoạch lựa chọn nhà thầu đã duyệt</w:t>
+      </w:r>
+      <w:r>
+        <w:rPr>
+          <w:rFonts w:ascii="Arial" w:hAnsi="Arial" w:cs="Arial"/>
+          <w:sz w:val="27"/>
+          <w:szCs w:val="27"/>
+        </w:rPr>
+        <w:t xml:space="preserve"> (mặc dù thực tế thời gian thực hiện sẽ bị lùi lại do phải tổ chức lại).</w:t>
+      </w:r>
+    </w:p>
+    <w:p>
+      <w:pPr>
+        <w:rPr>
+          <w:rFonts w:ascii="Arial" w:hAnsi="Arial" w:cs="Arial"/>
+          <w:sz w:val="27"/>
+          <w:szCs w:val="27"/>
+        </w:rPr>
+      </w:pPr>
+    </w:p>
+    <w:p>
+      <w:r>
+        <w:rPr>
+          <w:highlight w:val="yellow"/>
+        </w:rPr>
+        <w:t>Hủy thầu = t</w:t>
+      </w:r>
+      <w:r>
+        <w:t>ừ lúc phát hành hồ sơ → trước lúc ký hợp đồng.</w:t>
+      </w:r>
+    </w:p>
+    <w:p>
+      <w:r>
+        <w:lastRenderedPageBreak/>
+        <w:t>“</w:t>
+      </w:r>
+      <w:r>
+        <w:rPr>
+          <w:highlight w:val="yellow"/>
+        </w:rPr>
+        <w:t>Qua mạng mà tài khoản bị khóa</w:t>
+      </w:r>
+      <w:r>
+        <w:t xml:space="preserve"> → mất quyền đi tiếp </w:t>
+      </w:r>
+      <w:r>
+        <w:rPr>
+          <w:highlight w:val="yellow"/>
+        </w:rPr>
+        <w:t>→ dừng chấm.”</w:t>
+      </w:r>
+    </w:p>
+    <w:p>
+      <w:pPr>
+        <w:rPr>
+          <w:rFonts w:ascii="Arial" w:hAnsi="Arial" w:cs="Arial"/>
+          <w:sz w:val="27"/>
+          <w:szCs w:val="27"/>
+        </w:rPr>
+      </w:pPr>
+      <w:r>
+        <w:rPr>
+          <w:rFonts w:ascii="Arial" w:hAnsi="Arial" w:cs="Arial"/>
+          <w:sz w:val="27"/>
+          <w:szCs w:val="27"/>
+        </w:rPr>
+        <w:t xml:space="preserve">Đối với gói thầu đấu thầu trước, nếu dự án được phê duyệt sau đó có nội dung làm </w:t>
+      </w:r>
+      <w:r>
+        <w:rPr>
+          <w:rFonts w:ascii="Arial" w:hAnsi="Arial" w:cs="Arial"/>
+          <w:sz w:val="27"/>
+          <w:szCs w:val="27"/>
+          <w:highlight w:val="yellow"/>
+        </w:rPr>
+        <w:t>tăng giá gói thầu từ 30% trở lên</w:t>
+      </w:r>
+      <w:r>
+        <w:rPr>
+          <w:rFonts w:ascii="Arial" w:hAnsi="Arial" w:cs="Arial"/>
+          <w:sz w:val="27"/>
+          <w:szCs w:val="27"/>
+        </w:rPr>
+        <w:t xml:space="preserve"> (hoặc thay đổi tiêu chuẩn kỹ thuật quan trọng, thay đổi cấp công trình) thì chủ đầu tư </w:t>
+      </w:r>
+      <w:r>
+        <w:rPr>
+          <w:rFonts w:ascii="Arial" w:hAnsi="Arial" w:cs="Arial"/>
+          <w:sz w:val="27"/>
+          <w:szCs w:val="27"/>
+          <w:highlight w:val="yellow"/>
+        </w:rPr>
+        <w:t>phải hủy thầu.</w:t>
+      </w:r>
+    </w:p>
+    <w:p>
+      <w:pPr>
+        <w:rPr>
+          <w:rFonts w:ascii="Arial" w:hAnsi="Arial" w:cs="Arial"/>
+          <w:sz w:val="27"/>
+          <w:szCs w:val="27"/>
+        </w:rPr>
+      </w:pPr>
+    </w:p>
+    <w:p>
+      <w:pPr>
+        <w:rPr>
+          <w:rFonts w:ascii="Arial" w:hAnsi="Arial" w:cs="Arial"/>
+          <w:sz w:val="27"/>
+          <w:szCs w:val="27"/>
+        </w:rPr>
+      </w:pPr>
+      <w:r>
+        <w:rPr>
+          <w:rStyle w:val="apple-converted-space"/>
+          <w:rFonts w:ascii="Arial" w:hAnsi="Arial" w:cs="Arial"/>
+          <w:sz w:val="27"/>
+          <w:szCs w:val="27"/>
+        </w:rPr>
+        <w:t> </w:t>
+      </w:r>
+      <w:r>
+        <w:rPr>
+          <w:rFonts w:ascii="Arial" w:hAnsi="Arial" w:cs="Arial"/>
+          <w:sz w:val="27"/>
+          <w:szCs w:val="27"/>
+        </w:rPr>
+        <w:t xml:space="preserve">Khi nhà thầu trúng thầu </w:t>
+      </w:r>
+      <w:r>
+        <w:rPr>
+          <w:rFonts w:ascii="Arial" w:hAnsi="Arial" w:cs="Arial"/>
+          <w:sz w:val="27"/>
+          <w:szCs w:val="27"/>
+          <w:highlight w:val="yellow"/>
+        </w:rPr>
+        <w:t>không đến hoàn thiện/ký kết hợp đồng</w:t>
+      </w:r>
+      <w:r>
+        <w:rPr>
+          <w:rFonts w:ascii="Arial" w:hAnsi="Arial" w:cs="Arial"/>
+          <w:sz w:val="27"/>
+          <w:szCs w:val="27"/>
+        </w:rPr>
+        <w:t>, chủ đầu tư xử lý bằng cách: H</w:t>
+      </w:r>
+      <w:r>
+        <w:rPr>
+          <w:rFonts w:ascii="Arial" w:hAnsi="Arial" w:cs="Arial"/>
+          <w:sz w:val="27"/>
+          <w:szCs w:val="27"/>
+          <w:highlight w:val="yellow"/>
+        </w:rPr>
+        <w:t>ủy quyết định phê duyệt kết quả lựa chọn nhà thầu trước đó, sau đó mời nhà thầu xếp hạng thứ hai vào hoàn thiện hợp đồng.</w:t>
+      </w:r>
+    </w:p>
+    <w:p/>
+    <w:p/>
+    <w:p>
+      <w:pPr>
+        <w:rPr>
+          <w:rFonts w:ascii="Arial" w:hAnsi="Arial" w:cs="Arial"/>
+          <w:sz w:val="27"/>
+          <w:szCs w:val="27"/>
+        </w:rPr>
+      </w:pPr>
+      <w:r>
+        <w:rPr>
+          <w:rFonts w:ascii="Arial" w:hAnsi="Arial" w:cs="Arial"/>
+          <w:sz w:val="27"/>
+          <w:szCs w:val="27"/>
+          <w:highlight w:val="yellow"/>
+        </w:rPr>
+        <w:t>Chủ đầu tư và nhà thầu liên danh</w:t>
+      </w:r>
+      <w:r>
+        <w:rPr>
+          <w:rFonts w:ascii="Arial" w:hAnsi="Arial" w:cs="Arial"/>
+          <w:sz w:val="27"/>
+          <w:szCs w:val="27"/>
+        </w:rPr>
+        <w:t xml:space="preserve"> được </w:t>
+      </w:r>
+      <w:r>
+        <w:rPr>
+          <w:rFonts w:ascii="Arial" w:hAnsi="Arial" w:cs="Arial"/>
+          <w:sz w:val="27"/>
+          <w:szCs w:val="27"/>
+          <w:highlight w:val="yellow"/>
+        </w:rPr>
+        <w:t>thỏa thuận điều chỉnh phạm vi công việc giữa các thành viên</w:t>
+      </w:r>
+      <w:r>
+        <w:rPr>
+          <w:rFonts w:ascii="Arial" w:hAnsi="Arial" w:cs="Arial"/>
+          <w:sz w:val="27"/>
+          <w:szCs w:val="27"/>
+        </w:rPr>
+        <w:t xml:space="preserve"> trong trường hợp </w:t>
+      </w:r>
+      <w:r>
+        <w:rPr>
+          <w:rFonts w:ascii="Arial" w:hAnsi="Arial" w:cs="Arial"/>
+          <w:sz w:val="27"/>
+          <w:szCs w:val="27"/>
+          <w:highlight w:val="yellow"/>
+        </w:rPr>
+        <w:t>cần đẩy nhanh tiến độ thực hiện so với hợp đồng hoặc do điều kiện khách quan</w:t>
+      </w:r>
+      <w:r>
+        <w:rPr>
+          <w:rFonts w:ascii="Arial" w:hAnsi="Arial" w:cs="Arial"/>
+          <w:sz w:val="27"/>
+          <w:szCs w:val="27"/>
+        </w:rPr>
+        <w:t>/bất khả kháng.</w:t>
+      </w:r>
+    </w:p>
+    <w:p/>
+    <w:p>
+      <w:pPr>
+        <w:pStyle w:val="pdq2pgselectionanchorcontainer"/>
+      </w:pPr>
+      <w:r>
+        <w:rPr>
+          <w:rStyle w:val="Strong"/>
+        </w:rPr>
+        <w:t>Bảo đảm tăng: &gt;</w:t>
+      </w:r>
+      <w:r>
+        <w:rPr>
+          <w:rStyle w:val="Strong"/>
+          <w:highlight w:val="yellow"/>
+        </w:rPr>
+        <w:t>10% → trần 30%.</w:t>
+      </w:r>
+      <w:r>
+        <w:rPr>
+          <w:rStyle w:val="Strong"/>
+        </w:rPr>
+        <w:t xml:space="preserve"> </w:t>
+      </w:r>
+      <w:r>
+        <w:t xml:space="preserve">Riêng câu EC </w:t>
+      </w:r>
+      <w:r>
+        <w:rPr>
+          <w:rStyle w:val="Strong"/>
+        </w:rPr>
+        <w:t>85% giá gói thầu</w:t>
+      </w:r>
+      <w:r>
+        <w:t xml:space="preserve"> bạn vừa học thì </w:t>
+      </w:r>
+      <w:r>
+        <w:rPr>
+          <w:rStyle w:val="Strong"/>
+        </w:rPr>
+        <w:t>không đủ điều kiện để tăng lên 15%</w:t>
+      </w:r>
+      <w:r>
+        <w:t xml:space="preserve">, vì trường hợp xây lắp/EC phải </w:t>
+      </w:r>
+      <w:r>
+        <w:rPr>
+          <w:rStyle w:val="Strong"/>
+        </w:rPr>
+        <w:t>thấp hơn 80% giá gói thầu</w:t>
+      </w:r>
+      <w:r>
+        <w:t xml:space="preserve"> mới rơi vào tình huống này.</w:t>
+      </w:r>
+    </w:p>
+    <w:p>
+      <w:pPr>
+        <w:pStyle w:val="pdq2pgselectionanchorcontainer"/>
+        <w:rPr>
+          <w:rFonts w:ascii="Arial" w:hAnsi="Arial" w:cs="Arial"/>
+          <w:sz w:val="27"/>
+          <w:szCs w:val="27"/>
+        </w:rPr>
+      </w:pPr>
+      <w:r>
+        <w:rPr>
+          <w:rFonts w:ascii="Arial" w:hAnsi="Arial" w:cs="Arial"/>
+          <w:sz w:val="27"/>
+          <w:szCs w:val="27"/>
+        </w:rPr>
+        <w:t xml:space="preserve">Đối với hồ sơ dự thầu </w:t>
+      </w:r>
+      <w:r>
+        <w:rPr>
+          <w:rFonts w:ascii="Arial" w:hAnsi="Arial" w:cs="Arial"/>
+          <w:sz w:val="27"/>
+          <w:szCs w:val="27"/>
+          <w:highlight w:val="yellow"/>
+        </w:rPr>
+        <w:t>không cân bằng (</w:t>
+      </w:r>
+      <w:r>
+        <w:rPr>
+          <w:rFonts w:ascii="Arial" w:hAnsi="Arial" w:cs="Arial"/>
+          <w:sz w:val="27"/>
+          <w:szCs w:val="27"/>
+        </w:rPr>
+        <w:t xml:space="preserve">đơn giá cao hạng mục dễ, thấp hạng mục khó), chủ đầu tư có thể: (1) </w:t>
+      </w:r>
+      <w:r>
+        <w:rPr>
+          <w:rFonts w:ascii="Arial" w:hAnsi="Arial" w:cs="Arial"/>
+          <w:sz w:val="27"/>
+          <w:szCs w:val="27"/>
+          <w:highlight w:val="yellow"/>
+        </w:rPr>
+        <w:t>Yêu cầu nhà thầu làm rõ chi phí</w:t>
+      </w:r>
+      <w:r>
+        <w:rPr>
+          <w:rFonts w:ascii="Arial" w:hAnsi="Arial" w:cs="Arial"/>
+          <w:sz w:val="27"/>
+          <w:szCs w:val="27"/>
+        </w:rPr>
+        <w:t xml:space="preserve">; (2) </w:t>
+      </w:r>
+      <w:r>
+        <w:rPr>
+          <w:rFonts w:ascii="Arial" w:hAnsi="Arial" w:cs="Arial"/>
+          <w:sz w:val="27"/>
+          <w:szCs w:val="27"/>
+          <w:highlight w:val="yellow"/>
+        </w:rPr>
+        <w:t>Quy định giá trị bảo đảm thực hiện hợp đồng lớn hơn 10% (nhưng không quá 30%) để phòng ngừa rủi ro. Cả hai biện pháp này đều đúng.</w:t>
+      </w:r>
+    </w:p>
+    <w:p>
+      <w:pPr>
+        <w:pStyle w:val="pdq2pgselectionanchorcontainer"/>
+      </w:pPr>
+      <w:r>
+        <w:rPr>
+          <w:rFonts w:ascii="Arial" w:hAnsi="Arial" w:cs="Arial"/>
+          <w:sz w:val="27"/>
+          <w:szCs w:val="27"/>
+        </w:rPr>
+        <w:t>n</w:t>
+      </w:r>
+      <w:r>
+        <w:rPr>
+          <w:rFonts w:ascii="Arial" w:hAnsi="Arial" w:cs="Arial"/>
+          <w:sz w:val="27"/>
+          <w:szCs w:val="27"/>
+        </w:rPr>
+        <w:t xml:space="preserve">hà thầu tư vấn bị </w:t>
+      </w:r>
+      <w:r>
+        <w:rPr>
+          <w:rFonts w:ascii="Arial" w:hAnsi="Arial" w:cs="Arial"/>
+          <w:sz w:val="27"/>
+          <w:szCs w:val="27"/>
+          <w:highlight w:val="yellow"/>
+        </w:rPr>
+        <w:t>khóa tài khoản 06 tháng</w:t>
+      </w:r>
+      <w:r>
+        <w:rPr>
+          <w:rFonts w:ascii="Arial" w:hAnsi="Arial" w:cs="Arial"/>
+          <w:sz w:val="27"/>
+          <w:szCs w:val="27"/>
+        </w:rPr>
+        <w:t xml:space="preserve"> nếu </w:t>
+      </w:r>
+      <w:r>
+        <w:rPr>
+          <w:rFonts w:ascii="Arial" w:hAnsi="Arial" w:cs="Arial"/>
+          <w:sz w:val="27"/>
+          <w:szCs w:val="27"/>
+          <w:highlight w:val="yellow"/>
+        </w:rPr>
+        <w:t>sử dụng tài khoản của mình để thay chủ đầu tư đăng tải các nội dung thuộc trách nhiệm của chủ đầu tư</w:t>
+      </w:r>
+      <w:r>
+        <w:rPr>
+          <w:rFonts w:ascii="Arial" w:hAnsi="Arial" w:cs="Arial"/>
+          <w:sz w:val="27"/>
+          <w:szCs w:val="27"/>
+        </w:rPr>
+        <w:t xml:space="preserve"> (như thông báo mời thầu, kết quả lựa chọn...).</w:t>
+      </w:r>
+    </w:p>
+    <w:p>
+      <w:pPr>
+        <w:rPr>
+          <w:rFonts w:ascii="Arial" w:hAnsi="Arial" w:cs="Arial"/>
+          <w:sz w:val="27"/>
+          <w:szCs w:val="27"/>
+        </w:rPr>
+      </w:pPr>
+      <w:r>
+        <w:rPr>
+          <w:rFonts w:ascii="Arial" w:hAnsi="Arial" w:cs="Arial"/>
+          <w:sz w:val="27"/>
+          <w:szCs w:val="27"/>
+          <w:highlight w:val="yellow"/>
+        </w:rPr>
+        <w:t>Chủ đầu tư</w:t>
+      </w:r>
+      <w:r>
+        <w:rPr>
+          <w:rFonts w:ascii="Arial" w:hAnsi="Arial" w:cs="Arial"/>
+          <w:sz w:val="27"/>
+          <w:szCs w:val="27"/>
+        </w:rPr>
+        <w:t xml:space="preserve"> phải </w:t>
+      </w:r>
+      <w:r>
+        <w:rPr>
+          <w:rFonts w:ascii="Arial" w:hAnsi="Arial" w:cs="Arial"/>
+          <w:sz w:val="27"/>
+          <w:szCs w:val="27"/>
+          <w:highlight w:val="yellow"/>
+        </w:rPr>
+        <w:t>đăng tải danh sách nhà thầu vi phạm uy tín</w:t>
+      </w:r>
+      <w:r>
+        <w:rPr>
+          <w:rFonts w:ascii="Arial" w:hAnsi="Arial" w:cs="Arial"/>
+          <w:sz w:val="27"/>
+          <w:szCs w:val="27"/>
+        </w:rPr>
+        <w:t xml:space="preserve"> trong thời hạn 07 ngày làm việc kể từ ngày nhà thầu có hành vi vi phạm.</w:t>
+      </w:r>
+    </w:p>
+    <w:p>
+      <w:pPr>
+        <w:rPr>
+          <w:rStyle w:val="Strong"/>
+        </w:rPr>
+      </w:pPr>
+    </w:p>
+    <w:p>
+      <w:pPr>
+        <w:rPr>
+          <w:rStyle w:val="Strong"/>
+        </w:rPr>
+      </w:pPr>
+      <w:r>
+        <w:rPr>
+          <w:rFonts w:ascii="Arial" w:hAnsi="Arial" w:cs="Arial"/>
+          <w:sz w:val="27"/>
+          <w:szCs w:val="27"/>
+        </w:rPr>
+        <w:t xml:space="preserve">Đối với các </w:t>
+      </w:r>
+      <w:r>
+        <w:rPr>
+          <w:rFonts w:ascii="Arial" w:hAnsi="Arial" w:cs="Arial"/>
+          <w:sz w:val="27"/>
+          <w:szCs w:val="27"/>
+          <w:highlight w:val="yellow"/>
+        </w:rPr>
+        <w:t>gói thầu có giá trị bảo đảm dự thầu dưới 50 triệu đồng</w:t>
+      </w:r>
+      <w:r>
+        <w:rPr>
+          <w:rFonts w:ascii="Arial" w:hAnsi="Arial" w:cs="Arial"/>
+          <w:sz w:val="27"/>
+          <w:szCs w:val="27"/>
+        </w:rPr>
+        <w:t xml:space="preserve">, nhà thầu được </w:t>
+      </w:r>
+      <w:r>
+        <w:rPr>
+          <w:rFonts w:ascii="Arial" w:hAnsi="Arial" w:cs="Arial"/>
+          <w:sz w:val="27"/>
+          <w:szCs w:val="27"/>
+          <w:highlight w:val="yellow"/>
+        </w:rPr>
+        <w:t>phép cam kết trong đơn dự thầu mà không cần đính kèm thư bảo lãnh ngay khi nộp thầu</w:t>
+      </w:r>
+      <w:r>
+        <w:rPr>
+          <w:rStyle w:val="apple-converted-space"/>
+          <w:rFonts w:ascii="Arial" w:hAnsi="Arial" w:cs="Arial"/>
+          <w:sz w:val="27"/>
+          <w:szCs w:val="27"/>
+        </w:rPr>
+        <w:t> </w:t>
+      </w:r>
+    </w:p>
+    <w:p>
+      <w:pPr>
+        <w:rPr>
+          <w:rStyle w:val="Strong"/>
+        </w:rPr>
+      </w:pPr>
+      <w:r>
+        <w:rPr>
+          <w:rStyle w:val="Strong"/>
+        </w:rPr>
+        <w:t>40 triệu → cam kết trong đơn là đủ lúc nộp.</w:t>
+      </w:r>
+      <w:r>
+        <w:br/>
+      </w:r>
+      <w:r>
+        <w:rPr>
+          <w:rStyle w:val="Strong"/>
+        </w:rPr>
+        <w:t>50 triệu trở lên → nghĩ ngay đến thư bảo lãnh.</w:t>
+      </w:r>
+    </w:p>
+    <w:p>
+      <w:pPr>
+        <w:rPr>
+          <w:rStyle w:val="Strong"/>
+        </w:rPr>
+      </w:pPr>
+    </w:p>
+    <w:p>
+      <w:pPr>
+        <w:rPr>
+          <w:rFonts w:ascii="Arial" w:hAnsi="Arial" w:cs="Arial"/>
+          <w:sz w:val="27"/>
+          <w:szCs w:val="27"/>
+        </w:rPr>
+      </w:pPr>
+      <w:r>
+        <w:rPr>
+          <w:rFonts w:ascii="Arial" w:hAnsi="Arial" w:cs="Arial"/>
+          <w:sz w:val="27"/>
+          <w:szCs w:val="27"/>
+        </w:rPr>
+        <w:t xml:space="preserve">Chế tài cho việc không xác nhận trao hợp đồng (chào giá rút gọn) là khóa chức năng chào giá </w:t>
+      </w:r>
+      <w:r>
+        <w:rPr>
+          <w:rFonts w:ascii="Arial" w:hAnsi="Arial" w:cs="Arial"/>
+          <w:sz w:val="27"/>
+          <w:szCs w:val="27"/>
+          <w:highlight w:val="yellow"/>
+        </w:rPr>
+        <w:t>trực tuyến 06 tháng</w:t>
+      </w:r>
+      <w:r>
+        <w:rPr>
+          <w:rFonts w:ascii="Arial" w:hAnsi="Arial" w:cs="Arial"/>
+          <w:sz w:val="27"/>
+          <w:szCs w:val="27"/>
+        </w:rPr>
+        <w:t>. Phương án B nói "Khóa tài khoản 3 tháng" là không đúng (đây là đáp án cần chọn vì câu hỏi tìm phương án SAI).</w:t>
+      </w:r>
+    </w:p>
+    <w:p>
+      <w:pPr>
+        <w:rPr>
+          <w:rFonts w:ascii="Arial" w:hAnsi="Arial" w:cs="Arial"/>
+          <w:sz w:val="27"/>
+          <w:szCs w:val="27"/>
+        </w:rPr>
+      </w:pPr>
+    </w:p>
+    <w:p>
+      <w:pPr>
+        <w:rPr>
+          <w:rFonts w:ascii="Arial" w:hAnsi="Arial" w:cs="Arial"/>
+          <w:sz w:val="27"/>
+          <w:szCs w:val="27"/>
+        </w:rPr>
+      </w:pPr>
+      <w:r>
+        <w:rPr>
+          <w:rStyle w:val="apple-converted-space"/>
+          <w:rFonts w:ascii="Arial" w:hAnsi="Arial" w:cs="Arial"/>
+          <w:sz w:val="27"/>
+          <w:szCs w:val="27"/>
+        </w:rPr>
+        <w:lastRenderedPageBreak/>
+        <w:t> </w:t>
+      </w:r>
+      <w:r>
+        <w:rPr>
+          <w:rFonts w:ascii="Arial" w:hAnsi="Arial" w:cs="Arial"/>
+          <w:sz w:val="27"/>
+          <w:szCs w:val="27"/>
+        </w:rPr>
+        <w:t xml:space="preserve">Trong chào giá rút gọn, </w:t>
+      </w:r>
+      <w:r>
+        <w:rPr>
+          <w:rFonts w:ascii="Arial" w:hAnsi="Arial" w:cs="Arial"/>
+          <w:sz w:val="27"/>
+          <w:szCs w:val="27"/>
+          <w:highlight w:val="yellow"/>
+        </w:rPr>
+        <w:t>từ lượt chào thứ 2, giá chào không được thấp hơn 90% giá thấp nhất đang hiển thị</w:t>
+      </w:r>
+      <w:r>
+        <w:rPr>
+          <w:rFonts w:ascii="Arial" w:hAnsi="Arial" w:cs="Arial"/>
+          <w:sz w:val="27"/>
+          <w:szCs w:val="27"/>
+        </w:rPr>
+        <w:t xml:space="preserve"> (để tránh bán phá giá quá sâu ngay lập tức/thông thầu).</w:t>
+      </w:r>
+    </w:p>
+    <w:p>
+      <w:pPr>
+        <w:rPr>
+          <w:rFonts w:ascii="Arial" w:hAnsi="Arial" w:cs="Arial"/>
+          <w:sz w:val="27"/>
+          <w:szCs w:val="27"/>
+        </w:rPr>
+      </w:pPr>
+    </w:p>
+    <w:p>
+      <w:pPr>
+        <w:rPr>
+          <w:rFonts w:ascii="Arial" w:hAnsi="Arial" w:cs="Arial"/>
+          <w:sz w:val="27"/>
+          <w:szCs w:val="27"/>
+        </w:rPr>
+      </w:pPr>
+      <w:r>
+        <w:rPr>
+          <w:rFonts w:ascii="Arial" w:hAnsi="Arial" w:cs="Arial"/>
+          <w:sz w:val="27"/>
+          <w:szCs w:val="27"/>
+          <w:highlight w:val="yellow"/>
+        </w:rPr>
+        <w:t>Nếu nhà thầu từ chối tham gia chào giá trực tuyến</w:t>
+      </w:r>
+      <w:r>
+        <w:rPr>
+          <w:rFonts w:ascii="Arial" w:hAnsi="Arial" w:cs="Arial"/>
+          <w:sz w:val="27"/>
+          <w:szCs w:val="27"/>
+        </w:rPr>
+        <w:t xml:space="preserve"> (thông thường), </w:t>
+      </w:r>
+      <w:r>
+        <w:rPr>
+          <w:rFonts w:ascii="Arial" w:hAnsi="Arial" w:cs="Arial"/>
+          <w:sz w:val="27"/>
+          <w:szCs w:val="27"/>
+          <w:highlight w:val="yellow"/>
+        </w:rPr>
+        <w:t>hồ sơ dự thầu của họ sẽ tiếp tục được đánh giá về tài chính căn cứ theo giá đã nộp</w:t>
+      </w:r>
+      <w:r>
+        <w:rPr>
+          <w:rFonts w:ascii="Arial" w:hAnsi="Arial" w:cs="Arial"/>
+          <w:sz w:val="27"/>
+          <w:szCs w:val="27"/>
+        </w:rPr>
+        <w:t xml:space="preserve"> trong hồ sơ dự thầu ban đầu (trước thời điểm đóng thầu). Việc tham gia phiên chào giá trực tuyến là không bắt buộc. Nếu nhà thầu được mời nhưng từ chối tham gia, họ sẽ không bị xử phạt. Việc đánh giá sẽ được tiếp tục dựa trên giá dự thầu mà họ đã nộp trong hồ sơ dự thầu ban đầu. Nhà thầu này sẽ không có cơ hội chào giá cạnh tranh hơn trong phiên chào giá.</w:t>
+      </w:r>
+    </w:p>
+    <w:p>
+      <w:pPr>
+        <w:rPr>
+          <w:rFonts w:ascii="Arial" w:hAnsi="Arial" w:cs="Arial"/>
+          <w:sz w:val="27"/>
+          <w:szCs w:val="27"/>
+        </w:rPr>
+      </w:pPr>
+    </w:p>
+    <w:p>
+      <w:r>
+        <w:rPr>
+          <w:rFonts w:ascii="Arial" w:hAnsi="Arial" w:cs="Arial"/>
+          <w:sz w:val="27"/>
+          <w:szCs w:val="27"/>
+        </w:rPr>
+        <w:t xml:space="preserve">gói thầu thuộc </w:t>
+      </w:r>
+      <w:r>
+        <w:rPr>
+          <w:rFonts w:ascii="Arial" w:hAnsi="Arial" w:cs="Arial"/>
+          <w:sz w:val="27"/>
+          <w:szCs w:val="27"/>
+          <w:highlight w:val="yellow"/>
+        </w:rPr>
+        <w:t>dự toán mua sắm có giá gói thầu không quá 500 triệu đồng</w:t>
+      </w:r>
+      <w:r>
+        <w:rPr>
+          <w:rFonts w:ascii="Arial" w:hAnsi="Arial" w:cs="Arial"/>
+          <w:sz w:val="27"/>
+          <w:szCs w:val="27"/>
+        </w:rPr>
+        <w:t xml:space="preserve"> (đối với gói thầu thuộc dự án là không quá 01 tỷ đồng).</w:t>
+      </w:r>
+      <w:r>
+        <w:rPr>
+          <w:rStyle w:val="apple-converted-space"/>
+          <w:rFonts w:ascii="Arial" w:hAnsi="Arial" w:cs="Arial"/>
+          <w:sz w:val="27"/>
+          <w:szCs w:val="27"/>
+        </w:rPr>
+        <w:t> </w:t>
       </w:r>
     </w:p>
     <w:sectPr>
@@ -2027,6 +2846,46 @@
     <w:basedOn w:val="DefaultParagraphFont"/>
     <w:rsid w:val="00D52CC6"/>
   </w:style>
+  <w:style w:type="paragraph" w:customStyle="1" w:styleId="pdq2pgselectionanchorcontainer">
+    <w:name w:val="pdq2pg_selectionanchorcontainer"/>
+    <w:basedOn w:val="Normal"/>
+    <w:rsid w:val="00BB6C2F"/>
+    <w:pPr>
+      <w:spacing w:before="100" w:beforeAutospacing="1" w:after="100" w:afterAutospacing="1"/>
+    </w:pPr>
+    <w:rPr>
+      <w:rFonts w:ascii="Times New Roman" w:eastAsia="Times New Roman" w:hAnsi="Times New Roman" w:cs="Times New Roman"/>
+      <w:kern w:val="0"/>
+      <w14:ligatures w14:val="none"/>
+    </w:rPr>
+  </w:style>
+  <w:style w:type="character" w:styleId="Strong">
+    <w:name w:val="Strong"/>
+    <w:basedOn w:val="DefaultParagraphFont"/>
+    <w:uiPriority w:val="22"/>
+    <w:qFormat/>
+    <w:rsid w:val="00BB6C2F"/>
+    <w:rPr>
+      <w:b/>
+      <w:bCs/>
+    </w:rPr>
+  </w:style>
+  <w:style w:type="paragraph" w:styleId="NormalWeb">
+    <w:name w:val="Normal (Web)"/>
+    <w:basedOn w:val="Normal"/>
+    <w:uiPriority w:val="99"/>
+    <w:semiHidden/>
+    <w:unhideWhenUsed/>
+    <w:rsid w:val="00BB6C2F"/>
+    <w:pPr>
+      <w:spacing w:before="100" w:beforeAutospacing="1" w:after="100" w:afterAutospacing="1"/>
+    </w:pPr>
+    <w:rPr>
+      <w:rFonts w:ascii="Times New Roman" w:eastAsia="Times New Roman" w:hAnsi="Times New Roman" w:cs="Times New Roman"/>
+      <w:kern w:val="0"/>
+      <w14:ligatures w14:val="none"/>
+    </w:rPr>
+  </w:style>
 </w:styles>
 </file>
 

</xml_diff>